<commit_message>
Anamnese: seção 8 começa no topo da página 3
Evita o título quebrado entre as páginas 2 e 3.

Co-Authored-By: Claude Fable 5.1 <noreply@anthropic.com>
</commit_message>
<xml_diff>
--- a/anamnese-familiar/Anamnese_Social_Familiar_Santidade_Integral.docx
+++ b/anamnese-familiar/Anamnese_Social_Familiar_Santidade_Integral.docx
@@ -5726,6 +5726,11 @@
       </w:r>
     </w:p>
     <w:p>
+      <w:r>
+        <w:br w:type="page"/>
+      </w:r>
+    </w:p>
+    <w:p>
       <w:pPr>
         <w:keepNext/>
         <w:spacing w:before="160" w:after="60" w:line="240" w:lineRule="auto"/>

</xml_diff>

<commit_message>
Anamnese: versículo João 6:35 completo, em duas linhas equilibradas
Texto passa a incluir a abertura "Declarou-lhes, pois, Jesus". O
timbrado ganha suporte a quebra manual (\n) no versículo do título.

Co-Authored-By: Claude Fable 5.1 <noreply@anthropic.com>
</commit_message>
<xml_diff>
--- a/anamnese-familiar/Anamnese_Social_Familiar_Santidade_Integral.docx
+++ b/anamnese-familiar/Anamnese_Social_Familiar_Santidade_Integral.docx
@@ -47,7 +47,18 @@
           <w:color w:val="2D5130"/>
           <w:sz w:val="20"/>
         </w:rPr>
-        <w:t xml:space="preserve">“Eu sou o pão da vida; aquele que vem a mim não terá fome, e quem crê em mim nunca terá sede.”  </w:t>
+        <w:t>“Declarou-lhes, pois, Jesus: Eu sou o pão da vida; o que vem a mim jamais terá fome;</w:t>
+        <w:br/>
+      </w:r>
+      <w:r>
+        <w:rPr>
+          <w:rFonts w:ascii="Calibri" w:hAnsi="Calibri" w:eastAsia="Calibri"/>
+          <w:b w:val="0"/>
+          <w:i/>
+          <w:color w:val="2D5130"/>
+          <w:sz w:val="20"/>
+        </w:rPr>
+        <w:t xml:space="preserve">e o que crê em mim jamais terá sede.”  </w:t>
       </w:r>
       <w:r>
         <w:rPr>

</xml_diff>